<commit_message>
Portal: Controle de Desvios com os resultados da rodada 1 (21/10/2026) e os prints dos manuais das 14 telas
Co-Authored-By: Claude Sonnet 5.5 <noreply@anthropic.com>
Claude-Session: https://claude.ai/code/session_016ZyaVQ3Fat8knNf78iQG9U
</commit_message>
<xml_diff>
--- a/documentacao/arquivos/garantia-qualidade/LabMedSys - Modulo Garantia da Qualidade - Controle de Desvios - Tela 04 Avaliação Área - Anvisa.docx
+++ b/documentacao/arquivos/garantia-qualidade/LabMedSys - Modulo Garantia da Qualidade - Controle de Desvios - Tela 04 Avaliação Área - Anvisa.docx
@@ -946,7 +946,7 @@
               <w:rPr>
                 <w:szCs w:val="20"/>
               </w:rPr>
-              <w:t>21/10/2026</w:t>
+              <w:t>22/10/2026</w:t>
             </w:r>
           </w:p>
         </w:tc>
@@ -3519,10 +3519,10 @@
         <w:tblLook w:val="04A0" w:firstRow="1" w:lastRow="0" w:firstColumn="1" w:lastColumn="0" w:noHBand="0" w:noVBand="1"/>
       </w:tblPr>
       <w:tblGrid>
-        <w:gridCol w:w="2456"/>
-        <w:gridCol w:w="1293"/>
-        <w:gridCol w:w="4685"/>
-        <w:gridCol w:w="1197"/>
+        <w:gridCol w:w="2367"/>
+        <w:gridCol w:w="1280"/>
+        <w:gridCol w:w="4800"/>
+        <w:gridCol w:w="1184"/>
       </w:tblGrid>
       <w:tr>
         <w:trPr>
@@ -3531,7 +3531,7 @@
         </w:trPr>
         <w:tc>
           <w:tcPr>
-            <w:tcW w:w="2456" w:type="dxa"/>
+            <w:tcW w:w="2367" w:type="dxa"/>
             <w:shd w:val="clear" w:color="auto" w:fill="D9D9D9" w:themeFill="background1" w:themeFillShade="D9"/>
           </w:tcPr>
           <w:p>
@@ -3559,7 +3559,7 @@
         </w:tc>
         <w:tc>
           <w:tcPr>
-            <w:tcW w:w="1293" w:type="dxa"/>
+            <w:tcW w:w="1280" w:type="dxa"/>
             <w:shd w:val="clear" w:color="auto" w:fill="D9D9D9" w:themeFill="background1" w:themeFillShade="D9"/>
           </w:tcPr>
           <w:p>
@@ -3587,7 +3587,7 @@
         </w:tc>
         <w:tc>
           <w:tcPr>
-            <w:tcW w:w="4685" w:type="dxa"/>
+            <w:tcW w:w="4800" w:type="dxa"/>
             <w:shd w:val="clear" w:color="auto" w:fill="D9D9D9" w:themeFill="background1" w:themeFillShade="D9"/>
           </w:tcPr>
           <w:p>
@@ -3615,7 +3615,7 @@
         </w:tc>
         <w:tc>
           <w:tcPr>
-            <w:tcW w:w="1197" w:type="dxa"/>
+            <w:tcW w:w="1184" w:type="dxa"/>
             <w:shd w:val="clear" w:color="auto" w:fill="D9D9D9" w:themeFill="background1" w:themeFillShade="D9"/>
           </w:tcPr>
           <w:p>
@@ -3648,7 +3648,7 @@
         </w:trPr>
         <w:tc>
           <w:tcPr>
-            <w:tcW w:w="2456" w:type="dxa"/>
+            <w:tcW w:w="2367" w:type="dxa"/>
           </w:tcPr>
           <w:p>
             <w:pPr>
@@ -3671,7 +3671,7 @@
         </w:tc>
         <w:tc>
           <w:tcPr>
-            <w:tcW w:w="1293" w:type="dxa"/>
+            <w:tcW w:w="1280" w:type="dxa"/>
           </w:tcPr>
           <w:p>
             <w:pPr>
@@ -3694,7 +3694,7 @@
         </w:tc>
         <w:tc>
           <w:tcPr>
-            <w:tcW w:w="4685" w:type="dxa"/>
+            <w:tcW w:w="4800" w:type="dxa"/>
           </w:tcPr>
           <w:p>
             <w:pPr>
@@ -3731,7 +3731,7 @@
         </w:tc>
         <w:tc>
           <w:tcPr>
-            <w:tcW w:w="1197" w:type="dxa"/>
+            <w:tcW w:w="1184" w:type="dxa"/>
           </w:tcPr>
           <w:p>
             <w:pPr>
@@ -3759,7 +3759,7 @@
         </w:trPr>
         <w:tc>
           <w:tcPr>
-            <w:tcW w:w="2456" w:type="dxa"/>
+            <w:tcW w:w="2367" w:type="dxa"/>
           </w:tcPr>
           <w:p>
             <w:pPr>
@@ -3782,7 +3782,7 @@
         </w:tc>
         <w:tc>
           <w:tcPr>
-            <w:tcW w:w="1293" w:type="dxa"/>
+            <w:tcW w:w="1280" w:type="dxa"/>
           </w:tcPr>
           <w:p>
             <w:pPr>
@@ -3805,7 +3805,7 @@
         </w:tc>
         <w:tc>
           <w:tcPr>
-            <w:tcW w:w="4685" w:type="dxa"/>
+            <w:tcW w:w="4800" w:type="dxa"/>
           </w:tcPr>
           <w:p>
             <w:pPr>
@@ -3822,13 +3822,13 @@
                 <w:sz w:val="18"/>
                 <w:szCs w:val="20"/>
               </w:rPr>
-              <w:t xml:space="preserve">Cada área envolvida registra o seu parecer, obrigatório, e o desvio só avança quando todas avaliaram (RN-GQ-029, RN-GQ-030). O código desta tela não mostra prazo para a área responder nem aviso à área</w:t>
+              <w:t xml:space="preserve">Cada área envolvida registra o seu parecer, obrigatório, e o desvio só avança quando todas avaliaram (RN-GQ-029, RN-GQ-030). O código desta tela não mostra prazo para a área responder nem aviso à área. Confirmado em 21/10/2026 (CT-GQ-012 e CT-GQ-013): com só uma área avaliando, o desvio continuou em Pendente Responsável Área; quando a última avaliou, avançou</w:t>
             </w:r>
           </w:p>
         </w:tc>
         <w:tc>
           <w:tcPr>
-            <w:tcW w:w="1197" w:type="dxa"/>
+            <w:tcW w:w="1184" w:type="dxa"/>
           </w:tcPr>
           <w:p>
             <w:pPr>
@@ -3856,7 +3856,7 @@
         </w:trPr>
         <w:tc>
           <w:tcPr>
-            <w:tcW w:w="2456" w:type="dxa"/>
+            <w:tcW w:w="2367" w:type="dxa"/>
           </w:tcPr>
           <w:p>
             <w:pPr>
@@ -3879,7 +3879,7 @@
         </w:tc>
         <w:tc>
           <w:tcPr>
-            <w:tcW w:w="1293" w:type="dxa"/>
+            <w:tcW w:w="1280" w:type="dxa"/>
           </w:tcPr>
           <w:p>
             <w:pPr>
@@ -3902,7 +3902,7 @@
         </w:tc>
         <w:tc>
           <w:tcPr>
-            <w:tcW w:w="4685" w:type="dxa"/>
+            <w:tcW w:w="4800" w:type="dxa"/>
           </w:tcPr>
           <w:p>
             <w:pPr>
@@ -3925,7 +3925,7 @@
         </w:tc>
         <w:tc>
           <w:tcPr>
-            <w:tcW w:w="1197" w:type="dxa"/>
+            <w:tcW w:w="1184" w:type="dxa"/>
           </w:tcPr>
           <w:p>
             <w:pPr>
@@ -3953,7 +3953,7 @@
         </w:trPr>
         <w:tc>
           <w:tcPr>
-            <w:tcW w:w="2456" w:type="dxa"/>
+            <w:tcW w:w="2367" w:type="dxa"/>
           </w:tcPr>
           <w:p>
             <w:pPr>
@@ -3976,7 +3976,7 @@
         </w:tc>
         <w:tc>
           <w:tcPr>
-            <w:tcW w:w="1293" w:type="dxa"/>
+            <w:tcW w:w="1280" w:type="dxa"/>
           </w:tcPr>
           <w:p>
             <w:pPr>
@@ -3999,7 +3999,7 @@
         </w:tc>
         <w:tc>
           <w:tcPr>
-            <w:tcW w:w="4685" w:type="dxa"/>
+            <w:tcW w:w="4800" w:type="dxa"/>
           </w:tcPr>
           <w:p>
             <w:pPr>
@@ -4016,13 +4016,13 @@
                 <w:sz w:val="18"/>
                 <w:szCs w:val="20"/>
               </w:rPr>
-              <w:t xml:space="preserve">A avaliação grava responsável (usuário conectado), nome e data e hora do servidor (RN-GQ-D04-08). O histórico, porém, registra só a mudança de situação e a ligação da avaliação; o texto da observação não entra (RN-GQ-D04-12)</w:t>
+              <w:t xml:space="preserve">A avaliação grava responsável (usuário conectado), nome e data e hora do servidor (RN-GQ-D04-08). O histórico, porém, registra só a mudança de situação e a ligação da avaliação; o texto da observação não entra (RN-GQ-D04-12). Confirmado em 21/10/2026 (CT-GQ-F04, DV-GQ-036): o histórico do desvio não traz as observações das áreas</w:t>
             </w:r>
           </w:p>
         </w:tc>
         <w:tc>
           <w:tcPr>
-            <w:tcW w:w="1197" w:type="dxa"/>
+            <w:tcW w:w="1184" w:type="dxa"/>
           </w:tcPr>
           <w:p>
             <w:pPr>
@@ -4050,7 +4050,7 @@
         </w:trPr>
         <w:tc>
           <w:tcPr>
-            <w:tcW w:w="2456" w:type="dxa"/>
+            <w:tcW w:w="2367" w:type="dxa"/>
           </w:tcPr>
           <w:p>
             <w:pPr>
@@ -4073,7 +4073,7 @@
         </w:tc>
         <w:tc>
           <w:tcPr>
-            <w:tcW w:w="1293" w:type="dxa"/>
+            <w:tcW w:w="1280" w:type="dxa"/>
           </w:tcPr>
           <w:p>
             <w:pPr>
@@ -4096,7 +4096,7 @@
         </w:tc>
         <w:tc>
           <w:tcPr>
-            <w:tcW w:w="4685" w:type="dxa"/>
+            <w:tcW w:w="4800" w:type="dxa"/>
           </w:tcPr>
           <w:p>
             <w:pPr>
@@ -4119,7 +4119,7 @@
         </w:tc>
         <w:tc>
           <w:tcPr>
-            <w:tcW w:w="1197" w:type="dxa"/>
+            <w:tcW w:w="1184" w:type="dxa"/>
           </w:tcPr>
           <w:p>
             <w:pPr>
@@ -4147,7 +4147,7 @@
         </w:trPr>
         <w:tc>
           <w:tcPr>
-            <w:tcW w:w="2456" w:type="dxa"/>
+            <w:tcW w:w="2367" w:type="dxa"/>
           </w:tcPr>
           <w:p>
             <w:pPr>
@@ -4170,7 +4170,7 @@
         </w:tc>
         <w:tc>
           <w:tcPr>
-            <w:tcW w:w="1293" w:type="dxa"/>
+            <w:tcW w:w="1280" w:type="dxa"/>
           </w:tcPr>
           <w:p>
             <w:pPr>
@@ -4193,7 +4193,7 @@
         </w:tc>
         <w:tc>
           <w:tcPr>
-            <w:tcW w:w="4685" w:type="dxa"/>
+            <w:tcW w:w="4800" w:type="dxa"/>
           </w:tcPr>
           <w:p>
             <w:pPr>
@@ -4216,7 +4216,7 @@
         </w:tc>
         <w:tc>
           <w:tcPr>
-            <w:tcW w:w="1197" w:type="dxa"/>
+            <w:tcW w:w="1184" w:type="dxa"/>
           </w:tcPr>
           <w:p>
             <w:pPr>
@@ -4288,7 +4288,7 @@
         <w:rPr>
           <w:szCs w:val="20"/>
         </w:rPr>
-        <w:t xml:space="preserve">1. Quem avaliou este desvio pela área, e quando? O sistema mostra isso hoje? Em parte. A avaliação guarda responsável e data do servidor, mas o histórico do desvio não mostra o texto nem o autor da observação. 2. Todas as áreas afetadas foram ouvidas antes da decisão da GQ? O sistema mostra isso hoje? Sim. O desvio só avança quando todas as áreas chamadas avaliaram. Não mostra se a GQ chamou as áreas certas. 3. Em quanto tempo a área respondeu? O sistema mostra isso hoje? Não. Não há prazo nem controle de atraso nesta etapa. 4. Qual foi o motivo de uma mudança no parecer? O sistema mostra isso hoje? Não. O parecer não é refeito e o campo Justificativa não é gravado. 5. A data e o responsável que aparecem na tela são os do registro original? O sistema mostra isso hoje? Em parte. Alguns campos mostram a data de agora e o usuário que abriu a tela (RN-GQ-D04-15).</w:t>
+        <w:t xml:space="preserve">1. Quem avaliou este desvio pela área, e quando? O sistema mostra isso hoje? Em parte. A avaliação guarda responsável e data do servidor, mas o histórico do desvio não mostra o texto nem o autor da observação (texto ausente confirmado em 21/10/2026, DV-GQ-036). 2. Todas as áreas afetadas foram ouvidas antes da decisão da GQ? O sistema mostra isso hoje? Sim. O desvio só avança quando todas as áreas chamadas avaliaram (confirmado em 21/10/2026, CT-GQ-012 e CT-GQ-013). Não mostra se a GQ chamou as áreas certas. 3. Em quanto tempo a área respondeu? O sistema mostra isso hoje? Não. Não há prazo nem controle de atraso nesta etapa. 4. Qual foi o motivo de uma mudança no parecer? O sistema mostra isso hoje? Não. O parecer não é refeito e o campo Justificativa não é gravado. 5. A data e o responsável que aparecem na tela são os do registro original? O sistema mostra isso hoje? Em parte. Alguns campos mostram a data de agora e o usuário que abriu a tela (RN-GQ-D04-15).</w:t>
       </w:r>
     </w:p>
     <w:p>
@@ -4325,7 +4325,7 @@
         <w:rPr>
           <w:szCs w:val="20"/>
         </w:rPr>
-        <w:t xml:space="preserve">Gravar no histórico o texto do parecer, quem avaliou e quando (RN-GQ-D04-12).</w:t>
+        <w:t xml:space="preserve">Gravar no histórico o texto do parecer, quem avaliou e quando (RN-GQ-D04-12; o texto ausente foi confirmado na rodada 1, DV-GQ-036).</w:t>
       </w:r>
     </w:p>
     <w:p>
@@ -4416,6 +4416,24 @@
           <w:szCs w:val="20"/>
         </w:rPr>
         <w:t xml:space="preserve">Incluir um campo próprio para extensão ou impacto do desvio nesta área (Art. 332, II).</w:t>
+      </w:r>
+    </w:p>
+    <w:p>
+      <w:pPr>
+        <w:numPr>
+          <w:ilvl w:val="0"/>
+          <w:numId w:val="2"/>
+        </w:numPr>
+        <w:spacing w:after="0" w:line="360" w:lineRule="auto"/>
+        <w:rPr>
+          <w:szCs w:val="20"/>
+        </w:rPr>
+      </w:pPr>
+      <w:r>
+        <w:rPr>
+          <w:szCs w:val="20"/>
+        </w:rPr>
+        <w:t xml:space="preserve">Fazer a busca por número do desvio achar quando se digita o ano ("030/26"), separar "Finalizado" de "Pendente" no filtro de situação e avisar quando a data é inválida (DV-GQ-026, DV-GQ-028, DV-GQ-027). Inferência da análise: quem audita procura o desvio pelo número completo.</w:t>
       </w:r>
     </w:p>
     <w:p>
@@ -4448,7 +4466,7 @@
         <w:rPr>
           <w:szCs w:val="20"/>
         </w:rPr>
-        <w:t xml:space="preserve">Item 9.3.2.3 (Requisitos Operacionais), que lista entre as funções do sistema: "Trilhas de auditoria;" e "Mensagens de erro inequívocas." Aplicação: o histórico desta tela não registra o conteúdo da avaliação, e, quando há mais de uma recusa, a tela mostra só a última mensagem (RN-GQ-D04-10, a confirmar no teste).</w:t>
+        <w:t xml:space="preserve">Item 9.3.2.3 (Requisitos Operacionais), que lista entre as funções do sistema: "Trilhas de auditoria;" e "Mensagens de erro inequívocas." Aplicação: o histórico desta tela não registra o conteúdo da avaliação, e, quando há mais de uma recusa, a tela mostra só a última mensagem (RN-GQ-D04-10, a confirmar no teste). Nesta tela a perda de mensagens não foi testada; foi confirmada em outras telas do menu (DV-GQ-033).</w:t>
       </w:r>
     </w:p>
     <w:sectPr>

</xml_diff>

<commit_message>
Portal GQ: Controle de Desvios com a rodada 2 (22/10/2026) nas 14 telas, Words, inventário, Biblioteca, busca e painéis
Co-Authored-By: Claude Sonnet 5.5 <noreply@anthropic.com>
Claude-Session: https://claude.ai/code/session_016ZyaVQ3Fat8knNf78iQG9U
</commit_message>
<xml_diff>
--- a/documentacao/arquivos/garantia-qualidade/LabMedSys - Modulo Garantia da Qualidade - Controle de Desvios - Tela 04 Avaliação Área - Anvisa.docx
+++ b/documentacao/arquivos/garantia-qualidade/LabMedSys - Modulo Garantia da Qualidade - Controle de Desvios - Tela 04 Avaliação Área - Anvisa.docx
@@ -998,7 +998,7 @@
                 <w:rFonts w:eastAsia="Arial" w:cs="Arial"/>
                 <w:szCs w:val="20"/>
               </w:rPr>
-              <w:t>Rascunho: legado, a partir do código</w:t>
+              <w:t>Versão publicada no portal, sem os achados de segurança</w:t>
             </w:r>
           </w:p>
         </w:tc>
@@ -3519,10 +3519,10 @@
         <w:tblLook w:val="04A0" w:firstRow="1" w:lastRow="0" w:firstColumn="1" w:lastColumn="0" w:noHBand="0" w:noVBand="1"/>
       </w:tblPr>
       <w:tblGrid>
-        <w:gridCol w:w="2367"/>
-        <w:gridCol w:w="1280"/>
-        <w:gridCol w:w="4800"/>
-        <w:gridCol w:w="1184"/>
+        <w:gridCol w:w="2365"/>
+        <w:gridCol w:w="1295"/>
+        <w:gridCol w:w="4780"/>
+        <w:gridCol w:w="1191"/>
       </w:tblGrid>
       <w:tr>
         <w:trPr>
@@ -3531,7 +3531,7 @@
         </w:trPr>
         <w:tc>
           <w:tcPr>
-            <w:tcW w:w="2367" w:type="dxa"/>
+            <w:tcW w:w="2365" w:type="dxa"/>
             <w:shd w:val="clear" w:color="auto" w:fill="D9D9D9" w:themeFill="background1" w:themeFillShade="D9"/>
           </w:tcPr>
           <w:p>
@@ -3559,7 +3559,7 @@
         </w:tc>
         <w:tc>
           <w:tcPr>
-            <w:tcW w:w="1280" w:type="dxa"/>
+            <w:tcW w:w="1295" w:type="dxa"/>
             <w:shd w:val="clear" w:color="auto" w:fill="D9D9D9" w:themeFill="background1" w:themeFillShade="D9"/>
           </w:tcPr>
           <w:p>
@@ -3587,7 +3587,7 @@
         </w:tc>
         <w:tc>
           <w:tcPr>
-            <w:tcW w:w="4800" w:type="dxa"/>
+            <w:tcW w:w="4780" w:type="dxa"/>
             <w:shd w:val="clear" w:color="auto" w:fill="D9D9D9" w:themeFill="background1" w:themeFillShade="D9"/>
           </w:tcPr>
           <w:p>
@@ -3615,7 +3615,7 @@
         </w:tc>
         <w:tc>
           <w:tcPr>
-            <w:tcW w:w="1184" w:type="dxa"/>
+            <w:tcW w:w="1191" w:type="dxa"/>
             <w:shd w:val="clear" w:color="auto" w:fill="D9D9D9" w:themeFill="background1" w:themeFillShade="D9"/>
           </w:tcPr>
           <w:p>
@@ -3648,7 +3648,7 @@
         </w:trPr>
         <w:tc>
           <w:tcPr>
-            <w:tcW w:w="2367" w:type="dxa"/>
+            <w:tcW w:w="2365" w:type="dxa"/>
           </w:tcPr>
           <w:p>
             <w:pPr>
@@ -3671,7 +3671,7 @@
         </w:tc>
         <w:tc>
           <w:tcPr>
-            <w:tcW w:w="1280" w:type="dxa"/>
+            <w:tcW w:w="1295" w:type="dxa"/>
           </w:tcPr>
           <w:p>
             <w:pPr>
@@ -3694,7 +3694,7 @@
         </w:tc>
         <w:tc>
           <w:tcPr>
-            <w:tcW w:w="4800" w:type="dxa"/>
+            <w:tcW w:w="4780" w:type="dxa"/>
           </w:tcPr>
           <w:p>
             <w:pPr>
@@ -3731,7 +3731,7 @@
         </w:tc>
         <w:tc>
           <w:tcPr>
-            <w:tcW w:w="1184" w:type="dxa"/>
+            <w:tcW w:w="1191" w:type="dxa"/>
           </w:tcPr>
           <w:p>
             <w:pPr>
@@ -3759,7 +3759,7 @@
         </w:trPr>
         <w:tc>
           <w:tcPr>
-            <w:tcW w:w="2367" w:type="dxa"/>
+            <w:tcW w:w="2365" w:type="dxa"/>
           </w:tcPr>
           <w:p>
             <w:pPr>
@@ -3782,7 +3782,7 @@
         </w:tc>
         <w:tc>
           <w:tcPr>
-            <w:tcW w:w="1280" w:type="dxa"/>
+            <w:tcW w:w="1295" w:type="dxa"/>
           </w:tcPr>
           <w:p>
             <w:pPr>
@@ -3805,7 +3805,7 @@
         </w:tc>
         <w:tc>
           <w:tcPr>
-            <w:tcW w:w="4800" w:type="dxa"/>
+            <w:tcW w:w="4780" w:type="dxa"/>
           </w:tcPr>
           <w:p>
             <w:pPr>
@@ -3828,7 +3828,7 @@
         </w:tc>
         <w:tc>
           <w:tcPr>
-            <w:tcW w:w="1184" w:type="dxa"/>
+            <w:tcW w:w="1191" w:type="dxa"/>
           </w:tcPr>
           <w:p>
             <w:pPr>
@@ -3856,7 +3856,7 @@
         </w:trPr>
         <w:tc>
           <w:tcPr>
-            <w:tcW w:w="2367" w:type="dxa"/>
+            <w:tcW w:w="2365" w:type="dxa"/>
           </w:tcPr>
           <w:p>
             <w:pPr>
@@ -3879,7 +3879,7 @@
         </w:tc>
         <w:tc>
           <w:tcPr>
-            <w:tcW w:w="1280" w:type="dxa"/>
+            <w:tcW w:w="1295" w:type="dxa"/>
           </w:tcPr>
           <w:p>
             <w:pPr>
@@ -3902,7 +3902,7 @@
         </w:tc>
         <w:tc>
           <w:tcPr>
-            <w:tcW w:w="4800" w:type="dxa"/>
+            <w:tcW w:w="4780" w:type="dxa"/>
           </w:tcPr>
           <w:p>
             <w:pPr>
@@ -3925,7 +3925,7 @@
         </w:tc>
         <w:tc>
           <w:tcPr>
-            <w:tcW w:w="1184" w:type="dxa"/>
+            <w:tcW w:w="1191" w:type="dxa"/>
           </w:tcPr>
           <w:p>
             <w:pPr>
@@ -3953,104 +3953,7 @@
         </w:trPr>
         <w:tc>
           <w:tcPr>
-            <w:tcW w:w="2367" w:type="dxa"/>
-          </w:tcPr>
-          <w:p>
-            <w:pPr>
-              <w:widowControl/>
-              <w:spacing w:after="0" w:line="276" w:lineRule="auto"/>
-              <w:jc w:val="left"/>
-              <w:rPr>
-                <w:sz w:val="18"/>
-                <w:szCs w:val="18"/>
-              </w:rPr>
-            </w:pPr>
-            <w:r>
-              <w:rPr>
-                <w:sz w:val="18"/>
-                <w:szCs w:val="20"/>
-              </w:rPr>
-              <w:t xml:space="preserve">"Toda a alteração feita no registro de um documento deve ser assinada e datada, devendo permitir a leitura da informação original."</w:t>
-            </w:r>
-          </w:p>
-        </w:tc>
-        <w:tc>
-          <w:tcPr>
-            <w:tcW w:w="1280" w:type="dxa"/>
-          </w:tcPr>
-          <w:p>
-            <w:pPr>
-              <w:widowControl/>
-              <w:spacing w:after="0" w:line="276" w:lineRule="auto"/>
-              <w:jc w:val="left"/>
-              <w:rPr>
-                <w:sz w:val="18"/>
-                <w:szCs w:val="18"/>
-              </w:rPr>
-            </w:pPr>
-            <w:r>
-              <w:rPr>
-                <w:sz w:val="18"/>
-                <w:szCs w:val="20"/>
-              </w:rPr>
-              <w:t xml:space="preserve">Art. 125</w:t>
-            </w:r>
-          </w:p>
-        </w:tc>
-        <w:tc>
-          <w:tcPr>
-            <w:tcW w:w="4800" w:type="dxa"/>
-          </w:tcPr>
-          <w:p>
-            <w:pPr>
-              <w:widowControl/>
-              <w:spacing w:after="0" w:line="276" w:lineRule="auto"/>
-              <w:jc w:val="left"/>
-              <w:rPr>
-                <w:sz w:val="18"/>
-                <w:szCs w:val="18"/>
-              </w:rPr>
-            </w:pPr>
-            <w:r>
-              <w:rPr>
-                <w:sz w:val="18"/>
-                <w:szCs w:val="20"/>
-              </w:rPr>
-              <w:t xml:space="preserve">A avaliação grava responsável (usuário conectado), nome e data e hora do servidor (RN-GQ-D04-08). O histórico, porém, registra só a mudança de situação e a ligação da avaliação; o texto da observação não entra (RN-GQ-D04-12). Confirmado em 21/10/2026 (CT-GQ-F04, DV-GQ-036): o histórico do desvio não traz as observações das áreas</w:t>
-            </w:r>
-          </w:p>
-        </w:tc>
-        <w:tc>
-          <w:tcPr>
-            <w:tcW w:w="1184" w:type="dxa"/>
-          </w:tcPr>
-          <w:p>
-            <w:pPr>
-              <w:widowControl/>
-              <w:spacing w:after="0" w:line="276" w:lineRule="auto"/>
-              <w:jc w:val="left"/>
-              <w:rPr>
-                <w:sz w:val="18"/>
-                <w:szCs w:val="18"/>
-              </w:rPr>
-            </w:pPr>
-            <w:r>
-              <w:rPr>
-                <w:sz w:val="18"/>
-                <w:szCs w:val="20"/>
-              </w:rPr>
-              <w:t xml:space="preserve">Atende em parte</w:t>
-            </w:r>
-          </w:p>
-        </w:tc>
-      </w:tr>
-      <w:tr>
-        <w:trPr>
-          <w:cantSplit/>
-        </w:trPr>
-        <w:tc>
-          <w:tcPr>
-            <w:tcW w:w="2367" w:type="dxa"/>
+            <w:tcW w:w="2365" w:type="dxa"/>
           </w:tcPr>
           <w:p>
             <w:pPr>
@@ -4073,7 +3976,7 @@
         </w:tc>
         <w:tc>
           <w:tcPr>
-            <w:tcW w:w="1280" w:type="dxa"/>
+            <w:tcW w:w="1295" w:type="dxa"/>
           </w:tcPr>
           <w:p>
             <w:pPr>
@@ -4096,7 +3999,7 @@
         </w:tc>
         <w:tc>
           <w:tcPr>
-            <w:tcW w:w="4800" w:type="dxa"/>
+            <w:tcW w:w="4780" w:type="dxa"/>
           </w:tcPr>
           <w:p>
             <w:pPr>
@@ -4119,7 +4022,7 @@
         </w:tc>
         <w:tc>
           <w:tcPr>
-            <w:tcW w:w="1184" w:type="dxa"/>
+            <w:tcW w:w="1191" w:type="dxa"/>
           </w:tcPr>
           <w:p>
             <w:pPr>
@@ -4147,7 +4050,7 @@
         </w:trPr>
         <w:tc>
           <w:tcPr>
-            <w:tcW w:w="2367" w:type="dxa"/>
+            <w:tcW w:w="2365" w:type="dxa"/>
           </w:tcPr>
           <w:p>
             <w:pPr>
@@ -4170,7 +4073,7 @@
         </w:tc>
         <w:tc>
           <w:tcPr>
-            <w:tcW w:w="1280" w:type="dxa"/>
+            <w:tcW w:w="1295" w:type="dxa"/>
           </w:tcPr>
           <w:p>
             <w:pPr>
@@ -4193,7 +4096,7 @@
         </w:tc>
         <w:tc>
           <w:tcPr>
-            <w:tcW w:w="4800" w:type="dxa"/>
+            <w:tcW w:w="4780" w:type="dxa"/>
           </w:tcPr>
           <w:p>
             <w:pPr>
@@ -4216,7 +4119,7 @@
         </w:tc>
         <w:tc>
           <w:tcPr>
-            <w:tcW w:w="1184" w:type="dxa"/>
+            <w:tcW w:w="1191" w:type="dxa"/>
           </w:tcPr>
           <w:p>
             <w:pPr>

</xml_diff>

<commit_message>
Portal: todos os defeitos publicados, inclusive os de acesso e segurança; registros completos de Principal, Estoque e GQ; achados de segurança dos 9 módulos
Co-Authored-By: Claude Sonnet 5.5 <noreply@anthropic.com>
Claude-Session: https://claude.ai/code/session_016ZyaVQ3Fat8knNf78iQG9U
</commit_message>
<xml_diff>
--- a/documentacao/arquivos/garantia-qualidade/LabMedSys - Modulo Garantia da Qualidade - Controle de Desvios - Tela 04 Avaliação Área - Anvisa.docx
+++ b/documentacao/arquivos/garantia-qualidade/LabMedSys - Modulo Garantia da Qualidade - Controle de Desvios - Tela 04 Avaliação Área - Anvisa.docx
@@ -998,7 +998,7 @@
                 <w:rFonts w:eastAsia="Arial" w:cs="Arial"/>
                 <w:szCs w:val="20"/>
               </w:rPr>
-              <w:t>Versão publicada no portal, sem os achados de segurança</w:t>
+              <w:t>Rascunho: legado, a partir do código</w:t>
             </w:r>
           </w:p>
         </w:tc>
@@ -3519,10 +3519,10 @@
         <w:tblLook w:val="04A0" w:firstRow="1" w:lastRow="0" w:firstColumn="1" w:lastColumn="0" w:noHBand="0" w:noVBand="1"/>
       </w:tblPr>
       <w:tblGrid>
-        <w:gridCol w:w="2365"/>
-        <w:gridCol w:w="1295"/>
-        <w:gridCol w:w="4780"/>
-        <w:gridCol w:w="1191"/>
+        <w:gridCol w:w="2305"/>
+        <w:gridCol w:w="1271"/>
+        <w:gridCol w:w="4886"/>
+        <w:gridCol w:w="1169"/>
       </w:tblGrid>
       <w:tr>
         <w:trPr>
@@ -3531,7 +3531,7 @@
         </w:trPr>
         <w:tc>
           <w:tcPr>
-            <w:tcW w:w="2365" w:type="dxa"/>
+            <w:tcW w:w="2305" w:type="dxa"/>
             <w:shd w:val="clear" w:color="auto" w:fill="D9D9D9" w:themeFill="background1" w:themeFillShade="D9"/>
           </w:tcPr>
           <w:p>
@@ -3559,7 +3559,7 @@
         </w:tc>
         <w:tc>
           <w:tcPr>
-            <w:tcW w:w="1295" w:type="dxa"/>
+            <w:tcW w:w="1271" w:type="dxa"/>
             <w:shd w:val="clear" w:color="auto" w:fill="D9D9D9" w:themeFill="background1" w:themeFillShade="D9"/>
           </w:tcPr>
           <w:p>
@@ -3587,7 +3587,7 @@
         </w:tc>
         <w:tc>
           <w:tcPr>
-            <w:tcW w:w="4780" w:type="dxa"/>
+            <w:tcW w:w="4886" w:type="dxa"/>
             <w:shd w:val="clear" w:color="auto" w:fill="D9D9D9" w:themeFill="background1" w:themeFillShade="D9"/>
           </w:tcPr>
           <w:p>
@@ -3615,7 +3615,7 @@
         </w:tc>
         <w:tc>
           <w:tcPr>
-            <w:tcW w:w="1191" w:type="dxa"/>
+            <w:tcW w:w="1169" w:type="dxa"/>
             <w:shd w:val="clear" w:color="auto" w:fill="D9D9D9" w:themeFill="background1" w:themeFillShade="D9"/>
           </w:tcPr>
           <w:p>
@@ -3648,7 +3648,7 @@
         </w:trPr>
         <w:tc>
           <w:tcPr>
-            <w:tcW w:w="2365" w:type="dxa"/>
+            <w:tcW w:w="2305" w:type="dxa"/>
           </w:tcPr>
           <w:p>
             <w:pPr>
@@ -3671,7 +3671,7 @@
         </w:tc>
         <w:tc>
           <w:tcPr>
-            <w:tcW w:w="1295" w:type="dxa"/>
+            <w:tcW w:w="1271" w:type="dxa"/>
           </w:tcPr>
           <w:p>
             <w:pPr>
@@ -3694,7 +3694,7 @@
         </w:tc>
         <w:tc>
           <w:tcPr>
-            <w:tcW w:w="4780" w:type="dxa"/>
+            <w:tcW w:w="4886" w:type="dxa"/>
           </w:tcPr>
           <w:p>
             <w:pPr>
@@ -3731,7 +3731,7 @@
         </w:tc>
         <w:tc>
           <w:tcPr>
-            <w:tcW w:w="1191" w:type="dxa"/>
+            <w:tcW w:w="1169" w:type="dxa"/>
           </w:tcPr>
           <w:p>
             <w:pPr>
@@ -3759,7 +3759,7 @@
         </w:trPr>
         <w:tc>
           <w:tcPr>
-            <w:tcW w:w="2365" w:type="dxa"/>
+            <w:tcW w:w="2305" w:type="dxa"/>
           </w:tcPr>
           <w:p>
             <w:pPr>
@@ -3782,7 +3782,7 @@
         </w:tc>
         <w:tc>
           <w:tcPr>
-            <w:tcW w:w="1295" w:type="dxa"/>
+            <w:tcW w:w="1271" w:type="dxa"/>
           </w:tcPr>
           <w:p>
             <w:pPr>
@@ -3805,7 +3805,7 @@
         </w:tc>
         <w:tc>
           <w:tcPr>
-            <w:tcW w:w="4780" w:type="dxa"/>
+            <w:tcW w:w="4886" w:type="dxa"/>
           </w:tcPr>
           <w:p>
             <w:pPr>
@@ -3828,7 +3828,7 @@
         </w:tc>
         <w:tc>
           <w:tcPr>
-            <w:tcW w:w="1191" w:type="dxa"/>
+            <w:tcW w:w="1169" w:type="dxa"/>
           </w:tcPr>
           <w:p>
             <w:pPr>
@@ -3856,7 +3856,7 @@
         </w:trPr>
         <w:tc>
           <w:tcPr>
-            <w:tcW w:w="2365" w:type="dxa"/>
+            <w:tcW w:w="2305" w:type="dxa"/>
           </w:tcPr>
           <w:p>
             <w:pPr>
@@ -3879,7 +3879,7 @@
         </w:tc>
         <w:tc>
           <w:tcPr>
-            <w:tcW w:w="1295" w:type="dxa"/>
+            <w:tcW w:w="1271" w:type="dxa"/>
           </w:tcPr>
           <w:p>
             <w:pPr>
@@ -3902,7 +3902,7 @@
         </w:tc>
         <w:tc>
           <w:tcPr>
-            <w:tcW w:w="4780" w:type="dxa"/>
+            <w:tcW w:w="4886" w:type="dxa"/>
           </w:tcPr>
           <w:p>
             <w:pPr>
@@ -3925,7 +3925,7 @@
         </w:tc>
         <w:tc>
           <w:tcPr>
-            <w:tcW w:w="1191" w:type="dxa"/>
+            <w:tcW w:w="1169" w:type="dxa"/>
           </w:tcPr>
           <w:p>
             <w:pPr>
@@ -3953,7 +3953,7 @@
         </w:trPr>
         <w:tc>
           <w:tcPr>
-            <w:tcW w:w="2365" w:type="dxa"/>
+            <w:tcW w:w="2305" w:type="dxa"/>
           </w:tcPr>
           <w:p>
             <w:pPr>
@@ -3970,13 +3970,13 @@
                 <w:sz w:val="18"/>
                 <w:szCs w:val="20"/>
               </w:rPr>
-              <w:t xml:space="preserve">"Quando apropriado, o motivo da alteração deve ser registrado."</w:t>
+              <w:t xml:space="preserve">"Toda a alteração feita no registro de um documento deve ser assinada e datada, devendo permitir a leitura da informação original."</w:t>
             </w:r>
           </w:p>
         </w:tc>
         <w:tc>
           <w:tcPr>
-            <w:tcW w:w="1295" w:type="dxa"/>
+            <w:tcW w:w="1271" w:type="dxa"/>
           </w:tcPr>
           <w:p>
             <w:pPr>
@@ -3993,13 +3993,13 @@
                 <w:sz w:val="18"/>
                 <w:szCs w:val="20"/>
               </w:rPr>
-              <w:t xml:space="preserve">Art. 125, parágrafo único</w:t>
+              <w:t xml:space="preserve">Art. 125</w:t>
             </w:r>
           </w:p>
         </w:tc>
         <w:tc>
           <w:tcPr>
-            <w:tcW w:w="4780" w:type="dxa"/>
+            <w:tcW w:w="4886" w:type="dxa"/>
           </w:tcPr>
           <w:p>
             <w:pPr>
@@ -4016,13 +4016,13 @@
                 <w:sz w:val="18"/>
                 <w:szCs w:val="20"/>
               </w:rPr>
-              <w:t xml:space="preserve">O campo Justificativa aparece com asterisco, mas o servidor não o lê e o histórico recebe justificativa vazia (RN-GQ-D04-11, a confirmar no teste)</w:t>
+              <w:t xml:space="preserve">A avaliação grava responsável (usuário conectado), nome e data e hora do servidor (RN-GQ-D04-08). O histórico, porém, registra só a mudança de situação e a ligação da avaliação; o texto da observação não entra (RN-GQ-D04-12). Confirmado em 21/10/2026 (CT-GQ-F04, DV-GQ-036): o histórico do desvio não traz as observações das áreas Em 22/10/2026 (CT-GQ-N04-10, DV-GQ-042): a avaliação de uma área quando falta outra não deixou nenhum registro no histórico, e a que fechou a etapa deixou só a mudança de situação, com usuário e data, sem a observação nem a área avaliada.</w:t>
             </w:r>
           </w:p>
         </w:tc>
         <w:tc>
           <w:tcPr>
-            <w:tcW w:w="1191" w:type="dxa"/>
+            <w:tcW w:w="1169" w:type="dxa"/>
           </w:tcPr>
           <w:p>
             <w:pPr>
@@ -4050,7 +4050,104 @@
         </w:trPr>
         <w:tc>
           <w:tcPr>
-            <w:tcW w:w="2365" w:type="dxa"/>
+            <w:tcW w:w="2305" w:type="dxa"/>
+          </w:tcPr>
+          <w:p>
+            <w:pPr>
+              <w:widowControl/>
+              <w:spacing w:after="0" w:line="276" w:lineRule="auto"/>
+              <w:jc w:val="left"/>
+              <w:rPr>
+                <w:sz w:val="18"/>
+                <w:szCs w:val="18"/>
+              </w:rPr>
+            </w:pPr>
+            <w:r>
+              <w:rPr>
+                <w:sz w:val="18"/>
+                <w:szCs w:val="20"/>
+              </w:rPr>
+              <w:t xml:space="preserve">"Quando apropriado, o motivo da alteração deve ser registrado."</w:t>
+            </w:r>
+          </w:p>
+        </w:tc>
+        <w:tc>
+          <w:tcPr>
+            <w:tcW w:w="1271" w:type="dxa"/>
+          </w:tcPr>
+          <w:p>
+            <w:pPr>
+              <w:widowControl/>
+              <w:spacing w:after="0" w:line="276" w:lineRule="auto"/>
+              <w:jc w:val="left"/>
+              <w:rPr>
+                <w:sz w:val="18"/>
+                <w:szCs w:val="18"/>
+              </w:rPr>
+            </w:pPr>
+            <w:r>
+              <w:rPr>
+                <w:sz w:val="18"/>
+                <w:szCs w:val="20"/>
+              </w:rPr>
+              <w:t xml:space="preserve">Art. 125, parágrafo único</w:t>
+            </w:r>
+          </w:p>
+        </w:tc>
+        <w:tc>
+          <w:tcPr>
+            <w:tcW w:w="4886" w:type="dxa"/>
+          </w:tcPr>
+          <w:p>
+            <w:pPr>
+              <w:widowControl/>
+              <w:spacing w:after="0" w:line="276" w:lineRule="auto"/>
+              <w:jc w:val="left"/>
+              <w:rPr>
+                <w:sz w:val="18"/>
+                <w:szCs w:val="18"/>
+              </w:rPr>
+            </w:pPr>
+            <w:r>
+              <w:rPr>
+                <w:sz w:val="18"/>
+                <w:szCs w:val="20"/>
+              </w:rPr>
+              <w:t xml:space="preserve">O campo Justificativa aparece com asterisco, mas o servidor não o lê e o histórico recebe justificativa vazia (RN-GQ-D04-11, a confirmar no teste)</w:t>
+            </w:r>
+          </w:p>
+        </w:tc>
+        <w:tc>
+          <w:tcPr>
+            <w:tcW w:w="1169" w:type="dxa"/>
+          </w:tcPr>
+          <w:p>
+            <w:pPr>
+              <w:widowControl/>
+              <w:spacing w:after="0" w:line="276" w:lineRule="auto"/>
+              <w:jc w:val="left"/>
+              <w:rPr>
+                <w:sz w:val="18"/>
+                <w:szCs w:val="18"/>
+              </w:rPr>
+            </w:pPr>
+            <w:r>
+              <w:rPr>
+                <w:sz w:val="18"/>
+                <w:szCs w:val="20"/>
+              </w:rPr>
+              <w:t xml:space="preserve">Não atende</w:t>
+            </w:r>
+          </w:p>
+        </w:tc>
+      </w:tr>
+      <w:tr>
+        <w:trPr>
+          <w:cantSplit/>
+        </w:trPr>
+        <w:tc>
+          <w:tcPr>
+            <w:tcW w:w="2305" w:type="dxa"/>
           </w:tcPr>
           <w:p>
             <w:pPr>
@@ -4073,7 +4170,7 @@
         </w:tc>
         <w:tc>
           <w:tcPr>
-            <w:tcW w:w="1295" w:type="dxa"/>
+            <w:tcW w:w="1271" w:type="dxa"/>
           </w:tcPr>
           <w:p>
             <w:pPr>
@@ -4096,7 +4193,7 @@
         </w:tc>
         <w:tc>
           <w:tcPr>
-            <w:tcW w:w="4780" w:type="dxa"/>
+            <w:tcW w:w="4886" w:type="dxa"/>
           </w:tcPr>
           <w:p>
             <w:pPr>
@@ -4119,7 +4216,7 @@
         </w:tc>
         <w:tc>
           <w:tcPr>
-            <w:tcW w:w="1191" w:type="dxa"/>
+            <w:tcW w:w="1169" w:type="dxa"/>
           </w:tcPr>
           <w:p>
             <w:pPr>

</xml_diff>